<commit_message>
Add Barker et al. 2023 Arabidopsis spaceflight transcriptome meta-analysis (ref 11)
Cites the user's own npj Microgravity meta-analysis of 15 Arabidopsis spaceflight
transcriptome experiments (Barker, Kruse ... Gilroy 2023; doi:10.1038/s41526-023-
00247-6) in the introduction (stress signatures of spaceflight-grown plants) and
discussion. The meta-analysis found flight hardware and lighting drive much of
the between-experiment variation, with conserved hypoxia and oxidative-stress
signatures -- so it directly motivates this model, which supplies a physical
mechanism for that hardware dependence; the BRIC-specific O2 drawdown (sec 3.7)
is consistent with the reported hypoxia signatures. Added across MANUSCRIPT.md
(+ rebuilt .docx, 11 DOIs), manuscript.tex (named key, all resolve), and
DISCUSSION.md. tex structure validated.

Co-Authored-By: Claude Fable 5 <noreply@anthropic.com>
</commit_message>
<xml_diff>
--- a/results/MANUSCRIPT.docx
+++ b/results/MANUSCRIPT.docx
@@ -150,7 +150,7 @@
     </w:p>
     <w:p>
       <w:r>
-        <w:t>In microgravity there is no buoyancy. Density differences no longer generate motion, so in still air the only transport left is molecular diffusion. The unstirred boundary layer around a plant organ is expected to thicken, and the surface‑to‑bulk gradients of CO₂, O₂ and water vapour to steepen. This has been proposed for decades as a mechanism contributing to the altered morphology, gas exchange and stress signatures of spaceflight‑grown plants [1,2], and it is the stated rationale for the forced‑ventilation design of modern plant‑growth hardware. Yet the effect is difficult to measure directly: no whole‑chamber sensor resolves the sub‑millimetre boundary layer, and flight opportunities are scarce. A physically grounded, quantitative model is therefore valuable both to interpret existing results and to design hardware.</w:t>
+        <w:t>In microgravity there is no buoyancy. Density differences no longer generate motion, so in still air the only transport left is molecular diffusion. The unstirred boundary layer around a plant organ is expected to thicken, and the surface‑to‑bulk gradients of CO₂, O₂ and water vapour to steepen. This has been proposed for decades as a mechanism contributing to the altered morphology, gas exchange and stress signatures of spaceflight‑grown plants [1,2,11], and it is the stated rationale for the forced‑ventilation design of modern plant‑growth hardware. Yet the effect is difficult to measure directly: no whole‑chamber sensor resolves the sub‑millimetre boundary layer, and flight opportunities are scarce. A physically grounded, quantitative model is therefore valuable both to interpret existing results and to design hardware.</w:t>
       </w:r>
     </w:p>
     <w:p>
@@ -2272,7 +2272,16 @@
     </w:p>
     <w:p>
       <w:r>
-        <w:t>Because the effect is transport‑ rather than biochemistry‑limited, it is engineerable, and the same solver that quantifies the penalty sizes the forced airflow needed to remove it. The scale dependence of that requirement (≈ 2.6 → 11 → 21 cm s⁻¹ from leaf to canopy) is a concrete design guideline: a ventilation setting or permeable seal tuned on sparse plants will under‑serve a dense stand. The hardware mapping frames the three ISS systems as a ladder of increasing gas‑exchange control — sealed (both enclosure drift and surface layer), vented seal (enclosure fixed, surface not), actively ventilated (both fixed) — and the photosynthesis feedback converts these into a growth currency: a sealed dish fixes almost no carbon over a photoperiod. This offers a parsimonious, physics‑based contributor to the reduced growth and stress transcriptomes reported for sealed‑hardware spaceflight experiments [6,9], complementary to gravisensing‑ and light‑driven responses [7]. Consistent with a transport-limited mechanism, whole-stand gas exchange in microgravity is unchanged at saturating CO₂ [10] — exactly the regime in which the boundary-layer CO₂ limitation is relieved.</w:t>
+        <w:t xml:space="preserve">Because the effect is transport‑ rather than biochemistry‑limited, it is engineerable, and the same solver that quantifies the penalty sizes the forced airflow needed to remove it. The scale dependence of that requirement (≈ 2.6 → 11 → 21 cm s⁻¹ from leaf to canopy) is a concrete design guideline: a ventilation setting or permeable seal tuned on sparse plants will under‑serve a dense stand. The hardware mapping frames the three ISS systems as a ladder of increasing gas‑exchange control — sealed (both enclosure drift and surface layer), vented seal (enclosure fixed, surface not), actively ventilated (both fixed) — and the photosynthesis feedback converts these into a growth currency: a sealed dish fixes almost no carbon over a photoperiod. This offers a parsimonious, physics‑based contributor to the reduced growth and stress transcriptomes reported for sealed‑hardware spaceflight experiments [6,9], complementary to gravisensing‑ and light‑driven responses [7]. Consistent with a transport-limited mechanism, whole-stand gas exchange in microgravity is unchanged at saturating CO₂ [10] — exactly the regime in which the boundary-layer CO₂ limitation is relieved. Notably, a meta-analysis of 15 </w:t>
+      </w:r>
+      <w:r>
+        <w:rPr>
+          <w:i/>
+        </w:rPr>
+        <w:t>Arabidopsis</w:t>
+      </w:r>
+      <w:r>
+        <w:t xml:space="preserve"> spaceflight transcriptome experiments found that flight hardware and lighting impose some of the largest confounding effects on the response, with hypoxia and oxidative-stress signatures among its conserved features [11]; the present model provides a physical basis for that hardware dependence, and its BRIC-specific O₂ drawdown (§3.7) is consistent with the hypoxia signatures reported for sealed-canister experiments.</w:t>
       </w:r>
     </w:p>
     <w:p>
@@ -2768,6 +2777,41 @@
         <w:t>, 336–345 (2005). doi:10.1007/s00425-005-1529-1.</w:t>
       </w:r>
     </w:p>
+    <w:p>
+      <w:pPr>
+        <w:pStyle w:val="ListNumber"/>
+      </w:pPr>
+      <w:r>
+        <w:t xml:space="preserve">Barker, R., Kruse, C. P. S., Johnson, C., Saravia-Butler, A., Fogle, H., Chang, H.-S., Trane, R. M., Kinscherf, N., Villacampa, A., Manzano, A., Herranz, R., Davin, L. B., Lewis, N. G., Perera, I., Wolverton, C., Gupta, P., Jaiswal, P., Reinsch, S. S., Wyatt, S. &amp; Gilroy, S. Meta-analysis of the space flight and microgravity response of the </w:t>
+      </w:r>
+      <w:r>
+        <w:rPr>
+          <w:i/>
+        </w:rPr>
+        <w:t>Arabidopsis</w:t>
+      </w:r>
+      <w:r>
+        <w:t xml:space="preserve"> plant transcriptome. </w:t>
+      </w:r>
+      <w:r>
+        <w:rPr>
+          <w:i/>
+        </w:rPr>
+        <w:t>npj Microgravity</w:t>
+      </w:r>
+      <w:r>
+        <w:t xml:space="preserve"> </w:t>
+      </w:r>
+      <w:r>
+        <w:rPr>
+          <w:b/>
+        </w:rPr>
+        <w:t>9</w:t>
+      </w:r>
+      <w:r>
+        <w:t>, 21 (2023). doi:10.1038/s41526-023-00247-6.</w:t>
+      </w:r>
+    </w:p>
     <w:sectPr>
       <w:pgSz w:w="12240" w:h="15840"/>
       <w:pgMar w:top="1440" w:right="1440" w:bottom="1440" w:left="1440" w:header="720" w:footer="720" w:gutter="0"/>

</xml_diff>